<commit_message>
Update IoT, AI and ROS submissions to name-only reports
</commit_message>
<xml_diff>
--- a/IoT_Weather_Station_Deep_Bisen/report_editable.docx
+++ b/IoT_Weather_Station_Deep_Bisen/report_editable.docx
@@ -56,12 +56,6 @@
     <w:p>
       <w:r>
         <w:t>Student: Deep Bisen</w:t>
-        <w:br/>
-        <w:t>Roll number: [Roll Number]</w:t>
-        <w:br/>
-        <w:t>College: [College Name]</w:t>
-        <w:br/>
-        <w:t>Branch / Semester: [Branch / Semester]</w:t>
         <w:br/>
         <w:t>Date: 17 October 2026</w:t>
       </w:r>
@@ -1349,7 +1343,7 @@
     </w:tbl>
     <w:p>
       <w:r>
-        <w:t>Folder: IoT_Weather_Station_Deep_Bisen. Fill roll number, college and branch/semester, add real screenshots, update results with actual observations, then ZIP this folder and upload it to Google Drive. Share the instructor-accessible Drive link as required by the assignment. A prepared package without the pending evidence does not meet every submission requirement yet.</w:t>
+        <w:t>Folder: IoT_Weather_Station_Deep_Bisen. Add real screenshots, update results with actual observations, then ZIP this folder and upload it to Google Drive. Share the instructor-accessible Drive link as required by the assignment. A prepared package without the pending evidence does not meet every submission requirement yet.</w:t>
       </w:r>
     </w:p>
     <w:p>

</xml_diff>